<commit_message>
Ispravka rada za sintezu
</commit_message>
<xml_diff>
--- a/Project/front/Paper/SOLO sinteza.docx
+++ b/Project/front/Paper/SOLO sinteza.docx
@@ -160,31 +160,7 @@
           <w:rPr>
             <w:rStyle w:val="Hyperlink"/>
           </w:rPr>
-          <w:t>https://orcid.or</w:t>
-        </w:r>
-        <w:r>
-          <w:rPr>
-            <w:rStyle w:val="Hyperlink"/>
-          </w:rPr>
-          <w:t>g</w:t>
-        </w:r>
-        <w:r>
-          <w:rPr>
-            <w:rStyle w:val="Hyperlink"/>
-          </w:rPr>
-          <w:t>/0</w:t>
-        </w:r>
-        <w:r>
-          <w:rPr>
-            <w:rStyle w:val="Hyperlink"/>
-          </w:rPr>
-          <w:t>0</w:t>
-        </w:r>
-        <w:r>
-          <w:rPr>
-            <w:rStyle w:val="Hyperlink"/>
-          </w:rPr>
-          <w:t>09-0005-5193-5089</w:t>
+          <w:t>https://orcid.org/0009-0005-5193-5089</w:t>
         </w:r>
       </w:hyperlink>
       <w:r>
@@ -216,7 +192,19 @@
         <w:rPr>
           <w:lang w:val="en-US"/>
         </w:rPr>
-        <w:t>This paper describes the development of a system that can automatically create educational quizzes. The system uses artificial intelligence running locally on the user's computer, combined with semantic web technology and the SOLO taxonomy to generate questions that match different levels of student understanding. Some of the main features include a chatbot that helps students learn, a tool for running SPARQL queries against the knowledge base, and the ability to export the course ontology as an OWL file that can be opened in Protégé. The paper also includes a hands-on evaluation where the questions were manually reviewed to check how good they are and whether the wrong answer choices are tricky enough to actually test student knowledge.</w:t>
+        <w:t>This paper describes the development of a system that can automatically create educational quizzes. The system uses artificial intelligence running locally on the user's computer, combined with semantic web technology and the SOLO taxonomy to generate questions that match different levels of student understanding. Some of the main features include a chatbot that helps students learn, a tool for running SPARQL queries against the knowledge base, and the ability to export the course ontology as an OWL file that can be opened in Protégé. The paper also includes a hands</w:t>
+      </w:r>
+      <w:r>
+        <w:rPr>
+          <w:lang w:val="en-US"/>
+        </w:rPr>
+        <w:t xml:space="preserve"> </w:t>
+      </w:r>
+      <w:r>
+        <w:rPr>
+          <w:lang w:val="en-US"/>
+        </w:rPr>
+        <w:t>on evaluation where the questions were manually reviewed to check how good they are and whether the wrong answer choices are tricky enough to actually test student knowledge.</w:t>
       </w:r>
     </w:p>
     <w:p>
@@ -286,13 +274,66 @@
         <w:rPr>
           <w:lang w:val="en-US"/>
         </w:rPr>
-        <w:t>This project tries to help with that problem. The idea is to build a system that can take educational content, like a PDF of lecture notes, and automatically generate quiz questions from it. But not just random questions - questions that are organized according to the SOLO taxonomy</w:t>
-      </w:r>
-      <w:r>
-        <w:rPr>
-          <w:lang w:val="en-US"/>
-        </w:rPr>
-        <w:t xml:space="preserve"> [1]</w:t>
+        <w:t>This project tries to help with that problem. The idea is to build a system that can take educational content, like a PDF of lecture notes, and automatically generate quiz questions from it. But not just random questions</w:t>
+      </w:r>
+      <w:r>
+        <w:rPr>
+          <w:lang w:val="en-US"/>
+        </w:rPr>
+        <w:t>,</w:t>
+      </w:r>
+      <w:r>
+        <w:rPr>
+          <w:lang w:val="en-US"/>
+        </w:rPr>
+        <w:t xml:space="preserve"> questions that are organized according to the SOLO taxonomy</w:t>
+      </w:r>
+      <w:r>
+        <w:rPr>
+          <w:lang w:val="en-US"/>
+        </w:rPr>
+        <w:t xml:space="preserve"> </w:t>
+      </w:r>
+      <w:r>
+        <w:rPr>
+          <w:lang w:val="en-US"/>
+        </w:rPr>
+        <w:fldChar w:fldCharType="begin"/>
+      </w:r>
+      <w:r>
+        <w:rPr>
+          <w:lang w:val="en-US"/>
+        </w:rPr>
+        <w:instrText xml:space="preserve"> REF _Ref226578959 \n \h </w:instrText>
+      </w:r>
+      <w:r>
+        <w:rPr>
+          <w:lang w:val="en-US"/>
+        </w:rPr>
+      </w:r>
+      <w:r>
+        <w:rPr>
+          <w:lang w:val="en-US"/>
+        </w:rPr>
+        <w:fldChar w:fldCharType="separate"/>
+      </w:r>
+      <w:r>
+        <w:rPr>
+          <w:lang w:val="en-US"/>
+        </w:rPr>
+        <w:t>[1</w:t>
+      </w:r>
+      <w:r>
+        <w:rPr>
+          <w:lang w:val="en-US"/>
+        </w:rPr>
+        <w:t>]</w:t>
+      </w:r>
+      <w:r>
+        <w:rPr>
+          <w:lang w:val="en-US"/>
+        </w:rPr>
+        <w:fldChar w:fldCharType="end"/>
       </w:r>
       <w:r>
         <w:rPr>
@@ -304,13 +345,54 @@
         <w:rPr>
           <w:lang w:val="en-US"/>
         </w:rPr>
-        <w:t xml:space="preserve"> [2]</w:t>
-      </w:r>
-      <w:r>
-        <w:rPr>
-          <w:lang w:val="en-US"/>
-        </w:rPr>
-        <w:t xml:space="preserve"> so that connections between concepts can be explored.</w:t>
+        <w:t xml:space="preserve"> </w:t>
+      </w:r>
+      <w:r>
+        <w:rPr>
+          <w:lang w:val="en-US"/>
+        </w:rPr>
+        <w:fldChar w:fldCharType="begin"/>
+      </w:r>
+      <w:r>
+        <w:rPr>
+          <w:lang w:val="en-US"/>
+        </w:rPr>
+        <w:instrText xml:space="preserve"> REF _Ref226579002 \n \h </w:instrText>
+      </w:r>
+      <w:r>
+        <w:rPr>
+          <w:lang w:val="en-US"/>
+        </w:rPr>
+      </w:r>
+      <w:r>
+        <w:rPr>
+          <w:lang w:val="en-US"/>
+        </w:rPr>
+        <w:fldChar w:fldCharType="separate"/>
+      </w:r>
+      <w:r>
+        <w:rPr>
+          <w:lang w:val="en-US"/>
+        </w:rPr>
+        <w:t>[2]</w:t>
+      </w:r>
+      <w:r>
+        <w:rPr>
+          <w:lang w:val="en-US"/>
+        </w:rPr>
+        <w:fldChar w:fldCharType="end"/>
+      </w:r>
+      <w:r>
+        <w:rPr>
+          <w:lang w:val="en-US"/>
+        </w:rPr>
+        <w:t xml:space="preserve"> </w:t>
+      </w:r>
+      <w:r>
+        <w:rPr>
+          <w:lang w:val="en-US"/>
+        </w:rPr>
+        <w:t>so that connections between concepts can be explored.</w:t>
       </w:r>
     </w:p>
     <w:p>
@@ -340,7 +422,19 @@
         <w:pStyle w:val="Paragraph"/>
       </w:pPr>
       <w:r>
-        <w:t xml:space="preserve">The first and most obvious one is that creating quizzes manually is time-consuming. Teachers already have a lot on their plate, and spending hours writing questions for every topic is not always realistic. According to some research, writing a single good multiple-choice question can take 15 to 30 minutes if you want to do it properly. </w:t>
+        <w:t>The first and most obvious one is that creating quizzes manually is time</w:t>
+      </w:r>
+      <w:r>
+        <w:t xml:space="preserve"> </w:t>
+      </w:r>
+      <w:r>
+        <w:t>consuming. Teachers already have a lot on their plate, and spending hours writing questions for every topic is not always realistic. According to some research, writing a single good multiple</w:t>
+      </w:r>
+      <w:r>
+        <w:t xml:space="preserve"> </w:t>
+      </w:r>
+      <w:r>
+        <w:t xml:space="preserve">choice question can take 15 to 30 minutes if you want to do it properly. </w:t>
       </w:r>
       <w:r>
         <w:lastRenderedPageBreak/>
@@ -372,25 +466,66 @@
         <w:rPr>
           <w:lang w:val="en-US"/>
         </w:rPr>
-        <w:t>Project is not dependant on expensive cloud services. Many AI-powered tools today require API keys and charge money for every request. For a student project, or for schools with limited budgets, that is not always an option. By using Ollama</w:t>
-      </w:r>
-      <w:r>
-        <w:rPr>
-          <w:lang w:val="en-US"/>
-        </w:rPr>
-        <w:t xml:space="preserve"> [</w:t>
-      </w:r>
-      <w:r>
-        <w:rPr>
-          <w:lang w:val="en-US"/>
-        </w:rPr>
-        <w:t>3</w:t>
+        <w:t>Project is not dependant on expensive cloud services. Many AI</w:t>
+      </w:r>
+      <w:r>
+        <w:rPr>
+          <w:lang w:val="en-US"/>
+        </w:rPr>
+        <w:t xml:space="preserve"> </w:t>
+      </w:r>
+      <w:r>
+        <w:rPr>
+          <w:lang w:val="en-US"/>
+        </w:rPr>
+        <w:t>powered tools today require API keys and charge money for every request. For a student project, or for schools with limited budgets, that is not always an option. By using Ollama</w:t>
+      </w:r>
+      <w:r>
+        <w:rPr>
+          <w:lang w:val="en-US"/>
+        </w:rPr>
+        <w:t xml:space="preserve"> </w:t>
+      </w:r>
+      <w:r>
+        <w:rPr>
+          <w:lang w:val="en-US"/>
+        </w:rPr>
+        <w:fldChar w:fldCharType="begin"/>
+      </w:r>
+      <w:r>
+        <w:rPr>
+          <w:lang w:val="en-US"/>
+        </w:rPr>
+        <w:instrText xml:space="preserve"> REF _Ref226579229 \n \h </w:instrText>
+      </w:r>
+      <w:r>
+        <w:rPr>
+          <w:lang w:val="en-US"/>
+        </w:rPr>
+      </w:r>
+      <w:r>
+        <w:rPr>
+          <w:lang w:val="en-US"/>
+        </w:rPr>
+        <w:fldChar w:fldCharType="separate"/>
+      </w:r>
+      <w:r>
+        <w:rPr>
+          <w:lang w:val="en-US"/>
+        </w:rPr>
+        <w:t>[3</w:t>
       </w:r>
       <w:r>
         <w:rPr>
           <w:lang w:val="en-US"/>
         </w:rPr>
         <w:t>]</w:t>
+      </w:r>
+      <w:r>
+        <w:rPr>
+          <w:lang w:val="en-US"/>
+        </w:rPr>
+        <w:fldChar w:fldCharType="end"/>
       </w:r>
       <w:r>
         <w:rPr>
@@ -421,40 +556,35 @@
       <w:r>
         <w:t xml:space="preserve">The field of Automatic Question Generation (AQG) has evolved significantly over the past two decades. One of the foundational works is by </w:t>
       </w:r>
-      <w:hyperlink r:id="rId10" w:history="1">
-        <w:r>
-          <w:rPr>
-            <w:rStyle w:val="Hyperlink"/>
-          </w:rPr>
-          <w:t>Mitkov and Ha</w:t>
-        </w:r>
-        <w:r>
-          <w:rPr>
-            <w:rStyle w:val="Hyperlink"/>
-          </w:rPr>
-          <w:t xml:space="preserve"> [</w:t>
-        </w:r>
-        <w:r>
-          <w:rPr>
-            <w:rStyle w:val="Hyperlink"/>
-          </w:rPr>
-          <w:t>4</w:t>
-        </w:r>
-        <w:r>
-          <w:rPr>
-            <w:rStyle w:val="Hyperlink"/>
-          </w:rPr>
-          <w:t>]</w:t>
-        </w:r>
-        <w:r>
-          <w:rPr>
-            <w:rStyle w:val="Hyperlink"/>
-          </w:rPr>
-          <w:t xml:space="preserve"> (2003)</w:t>
-        </w:r>
-      </w:hyperlink>
-      <w:r>
-        <w:t xml:space="preserve">, who developed a system that used natural language processing rules to transform declarative sentences into questions. Their approach could take a sentence like "Photosynthesis occurs in chloroplasts" and generate "Where does photosynthesis occur?" While effective for simple factual content, these rule-based systems struggled with complex material and often produced grammatically awkward questions. </w:t>
+      <w:r>
+        <w:t>Mitkov and Ha</w:t>
+      </w:r>
+      <w:r>
+        <w:t xml:space="preserve"> </w:t>
+      </w:r>
+      <w:r>
+        <w:fldChar w:fldCharType="begin"/>
+      </w:r>
+      <w:r>
+        <w:instrText xml:space="preserve"> REF _Ref226579268 \n \h </w:instrText>
+      </w:r>
+      <w:r>
+        <w:fldChar w:fldCharType="separate"/>
+      </w:r>
+      <w:r>
+        <w:t>[4]</w:t>
+      </w:r>
+      <w:r>
+        <w:fldChar w:fldCharType="end"/>
+      </w:r>
+      <w:r>
+        <w:t>, who developed a system that used natural language processing rules to transform declarative sentences into questions. Their approach could take a sentence like "Photosynthesis occurs in chloroplasts" and generate "Where does photosynthesis occur?" While effective for simple factual content, these rule</w:t>
+      </w:r>
+      <w:r>
+        <w:t xml:space="preserve"> </w:t>
+      </w:r>
+      <w:r>
+        <w:t xml:space="preserve">based systems struggled with complex material and often produced grammatically awkward questions. </w:t>
       </w:r>
     </w:p>
     <w:p>
@@ -470,43 +600,53 @@
         </w:rPr>
         <w:t xml:space="preserve">The challenge of generating good distractors has received special attention. </w:t>
       </w:r>
-      <w:hyperlink r:id="rId11" w:history="1">
-        <w:r>
-          <w:rPr>
-            <w:rStyle w:val="Hyperlink"/>
-            <w:lang w:val="en-US"/>
-          </w:rPr>
-          <w:t xml:space="preserve">Liang et al. </w:t>
-        </w:r>
-        <w:r>
-          <w:rPr>
-            <w:rStyle w:val="Hyperlink"/>
-            <w:lang w:val="en-US"/>
-          </w:rPr>
-          <w:t>[</w:t>
-        </w:r>
-        <w:r>
-          <w:rPr>
-            <w:rStyle w:val="Hyperlink"/>
-            <w:lang w:val="en-US"/>
-          </w:rPr>
-          <w:t>5</w:t>
-        </w:r>
-        <w:r>
-          <w:rPr>
-            <w:rStyle w:val="Hyperlink"/>
-            <w:lang w:val="en-US"/>
-          </w:rPr>
-          <w:t xml:space="preserve">] </w:t>
-        </w:r>
-        <w:r>
-          <w:rPr>
-            <w:rStyle w:val="Hyperlink"/>
-            <w:lang w:val="en-US"/>
-          </w:rPr>
-          <w:t>(2018)</w:t>
-        </w:r>
-      </w:hyperlink>
+      <w:r>
+        <w:rPr>
+          <w:lang w:val="en-US"/>
+        </w:rPr>
+        <w:t xml:space="preserve">Liang et al. </w:t>
+      </w:r>
+      <w:r>
+        <w:rPr>
+          <w:lang w:val="en-US"/>
+        </w:rPr>
+        <w:fldChar w:fldCharType="begin"/>
+      </w:r>
+      <w:r>
+        <w:rPr>
+          <w:lang w:val="en-US"/>
+        </w:rPr>
+        <w:instrText xml:space="preserve"> REF _Ref226579339 \n \h </w:instrText>
+      </w:r>
+      <w:r>
+        <w:rPr>
+          <w:lang w:val="en-US"/>
+        </w:rPr>
+      </w:r>
+      <w:r>
+        <w:rPr>
+          <w:lang w:val="en-US"/>
+        </w:rPr>
+        <w:fldChar w:fldCharType="separate"/>
+      </w:r>
+      <w:r>
+        <w:rPr>
+          <w:lang w:val="en-US"/>
+        </w:rPr>
+        <w:t>[5]</w:t>
+      </w:r>
+      <w:r>
+        <w:rPr>
+          <w:lang w:val="en-US"/>
+        </w:rPr>
+        <w:fldChar w:fldCharType="end"/>
+      </w:r>
+      <w:r>
+        <w:rPr>
+          <w:lang w:val="en-US"/>
+        </w:rPr>
+        <w:t xml:space="preserve"> </w:t>
+      </w:r>
       <w:r>
         <w:rPr>
           <w:lang w:val="en-US"/>
@@ -527,48 +667,76 @@
         </w:rPr>
         <w:t xml:space="preserve"> More recently, </w:t>
       </w:r>
-      <w:hyperlink r:id="rId12" w:history="1">
-        <w:r>
-          <w:rPr>
-            <w:rStyle w:val="Hyperlink"/>
-            <w:lang w:val="en-US"/>
-          </w:rPr>
-          <w:t xml:space="preserve">Kasneci et al. </w:t>
-        </w:r>
-        <w:r>
-          <w:rPr>
-            <w:rStyle w:val="Hyperlink"/>
-            <w:lang w:val="en-US"/>
-          </w:rPr>
-          <w:t>[</w:t>
-        </w:r>
-        <w:r>
-          <w:rPr>
-            <w:rStyle w:val="Hyperlink"/>
-            <w:lang w:val="en-US"/>
-          </w:rPr>
-          <w:t>6</w:t>
-        </w:r>
-        <w:r>
-          <w:rPr>
-            <w:rStyle w:val="Hyperlink"/>
-            <w:lang w:val="en-US"/>
-          </w:rPr>
-          <w:t xml:space="preserve">] </w:t>
-        </w:r>
-        <w:r>
-          <w:rPr>
-            <w:rStyle w:val="Hyperlink"/>
-            <w:lang w:val="en-US"/>
-          </w:rPr>
-          <w:t>(2023)</w:t>
-        </w:r>
-      </w:hyperlink>
-      <w:r>
-        <w:rPr>
-          <w:lang w:val="en-US"/>
-        </w:rPr>
-        <w:t xml:space="preserve"> published a comprehensive review of using large language models like ChatGPT in education. They highlighted both the potential and the risks, noting that while these models can generate diverse questions quickly, they also raise concerns about accuracy, bias, and the need for teacher oversight. Importantly, they pointed out that cloud-based solutions create privacy issues when handling student data, which is one reason why local AI solutions like the one in this project are valuable.</w:t>
+      <w:r>
+        <w:rPr>
+          <w:lang w:val="en-US"/>
+        </w:rPr>
+        <w:t xml:space="preserve">Kasneci et al. </w:t>
+      </w:r>
+      <w:r>
+        <w:rPr>
+          <w:lang w:val="en-US"/>
+        </w:rPr>
+        <w:fldChar w:fldCharType="begin"/>
+      </w:r>
+      <w:r>
+        <w:rPr>
+          <w:lang w:val="en-US"/>
+        </w:rPr>
+        <w:instrText xml:space="preserve"> REF _Ref226579354 \n \h </w:instrText>
+      </w:r>
+      <w:r>
+        <w:rPr>
+          <w:lang w:val="en-US"/>
+        </w:rPr>
+      </w:r>
+      <w:r>
+        <w:rPr>
+          <w:lang w:val="en-US"/>
+        </w:rPr>
+        <w:fldChar w:fldCharType="separate"/>
+      </w:r>
+      <w:r>
+        <w:rPr>
+          <w:lang w:val="en-US"/>
+        </w:rPr>
+        <w:t>[6]</w:t>
+      </w:r>
+      <w:r>
+        <w:rPr>
+          <w:lang w:val="en-US"/>
+        </w:rPr>
+        <w:fldChar w:fldCharType="end"/>
+      </w:r>
+      <w:r>
+        <w:rPr>
+          <w:lang w:val="en-US"/>
+        </w:rPr>
+        <w:t xml:space="preserve"> </w:t>
+      </w:r>
+      <w:r>
+        <w:rPr>
+          <w:lang w:val="en-US"/>
+        </w:rPr>
+        <w:t>(2023)</w:t>
+      </w:r>
+      <w:r>
+        <w:rPr>
+          <w:lang w:val="en-US"/>
+        </w:rPr>
+        <w:t xml:space="preserve"> published a comprehensive review of using large language models like ChatGPT in education. They highlighted both the potential and the risks, noting that while these models can generate diverse questions quickly, they also raise concerns about accuracy, bias, and the need for teacher oversight. Importantly, they pointed out that cloud</w:t>
+      </w:r>
+      <w:r>
+        <w:rPr>
+          <w:lang w:val="en-US"/>
+        </w:rPr>
+        <w:t xml:space="preserve"> </w:t>
+      </w:r>
+      <w:r>
+        <w:rPr>
+          <w:lang w:val="en-US"/>
+        </w:rPr>
+        <w:t>based solutions create privacy issues when handling student data, which is one reason why local AI solutions like the one in this project are valuable.</w:t>
       </w:r>
     </w:p>
     <w:p>
@@ -578,48 +746,88 @@
           <w:lang w:val="en-US"/>
         </w:rPr>
       </w:pPr>
-      <w:hyperlink r:id="rId13" w:history="1">
-        <w:r>
-          <w:rPr>
-            <w:rStyle w:val="Hyperlink"/>
-            <w:lang w:val="en-US"/>
-          </w:rPr>
-          <w:t xml:space="preserve">Lister et al. </w:t>
-        </w:r>
-        <w:r>
-          <w:rPr>
-            <w:rStyle w:val="Hyperlink"/>
-            <w:lang w:val="en-US"/>
-          </w:rPr>
-          <w:t>[</w:t>
-        </w:r>
-        <w:r>
-          <w:rPr>
-            <w:rStyle w:val="Hyperlink"/>
-            <w:lang w:val="en-US"/>
-          </w:rPr>
-          <w:t>7</w:t>
-        </w:r>
-        <w:r>
-          <w:rPr>
-            <w:rStyle w:val="Hyperlink"/>
-            <w:lang w:val="en-US"/>
-          </w:rPr>
-          <w:t xml:space="preserve">] </w:t>
-        </w:r>
-        <w:r>
-          <w:rPr>
-            <w:rStyle w:val="Hyperlink"/>
-            <w:lang w:val="en-US"/>
-          </w:rPr>
-          <w:t>(2006) </w:t>
-        </w:r>
-      </w:hyperlink>
-      <w:r>
-        <w:rPr>
-          <w:lang w:val="en-US"/>
-        </w:rPr>
-        <w:t>examined how the SOLO (Structure of Observed Learning Outcomes) taxonomy could be applied to classify and evaluate programming questions. Their seminal work, "Not seeing the forest for the trees: novice programmers and the SOLO taxonomy," revealed a critical insight: many programming education assessments focus too heavily on low-level skills (identifying syntax errors, recognizing code fragments) while neglecting higher-order thinking skills (integrating concepts, designing solutions). They demonstrated that exam questions could be systematically classified into SOLO levels</w:t>
+      <w:r>
+        <w:rPr>
+          <w:lang w:val="en-US"/>
+        </w:rPr>
+        <w:t xml:space="preserve">Lister et al. </w:t>
+      </w:r>
+      <w:r>
+        <w:rPr>
+          <w:lang w:val="en-US"/>
+        </w:rPr>
+        <w:fldChar w:fldCharType="begin"/>
+      </w:r>
+      <w:r>
+        <w:rPr>
+          <w:lang w:val="en-US"/>
+        </w:rPr>
+        <w:instrText xml:space="preserve"> REF _Ref226579366 \n \h </w:instrText>
+      </w:r>
+      <w:r>
+        <w:rPr>
+          <w:lang w:val="en-US"/>
+        </w:rPr>
+      </w:r>
+      <w:r>
+        <w:rPr>
+          <w:lang w:val="en-US"/>
+        </w:rPr>
+        <w:fldChar w:fldCharType="separate"/>
+      </w:r>
+      <w:r>
+        <w:rPr>
+          <w:lang w:val="en-US"/>
+        </w:rPr>
+        <w:t>[7]</w:t>
+      </w:r>
+      <w:r>
+        <w:rPr>
+          <w:lang w:val="en-US"/>
+        </w:rPr>
+        <w:fldChar w:fldCharType="end"/>
+      </w:r>
+      <w:r>
+        <w:rPr>
+          <w:lang w:val="en-US"/>
+        </w:rPr>
+        <w:t xml:space="preserve"> </w:t>
+      </w:r>
+      <w:r>
+        <w:rPr>
+          <w:lang w:val="en-US"/>
+        </w:rPr>
+        <w:t>(2006) </w:t>
+      </w:r>
+      <w:r>
+        <w:rPr>
+          <w:lang w:val="en-US"/>
+        </w:rPr>
+        <w:t>examined how the SOLO (Structure of Observed Learning Outcomes) taxonomy could be applied to classify and evaluate programming questions. Their seminal work, "Not seeing the forest for the trees: novice programmers and the SOLO taxonomy," revealed a critical insight: many programming education assessments focus too heavily on low</w:t>
+      </w:r>
+      <w:r>
+        <w:rPr>
+          <w:lang w:val="en-US"/>
+        </w:rPr>
+        <w:t xml:space="preserve"> </w:t>
+      </w:r>
+      <w:r>
+        <w:rPr>
+          <w:lang w:val="en-US"/>
+        </w:rPr>
+        <w:t>level skills (identifying syntax errors, recognizing code fragments) while neglecting higher</w:t>
+      </w:r>
+      <w:r>
+        <w:rPr>
+          <w:lang w:val="en-US"/>
+        </w:rPr>
+        <w:t xml:space="preserve"> </w:t>
+      </w:r>
+      <w:r>
+        <w:rPr>
+          <w:lang w:val="en-US"/>
+        </w:rPr>
+        <w:t>order thinking skills (integrating concepts, designing solutions). They demonstrated that exam questions could be systematically classified into SOLO levels</w:t>
       </w:r>
       <w:r>
         <w:rPr>
@@ -631,7 +839,19 @@
         <w:rPr>
           <w:lang w:val="en-US"/>
         </w:rPr>
-        <w:t>from uni-structural questions that test single concepts like "What does this variable store?" to extended abstract questions like "Design a program that solves this complex problem using multiple data structures." Their framework provides a structured way to ensure that questions across all complexity levels are included</w:t>
+        <w:t>from uni</w:t>
+      </w:r>
+      <w:r>
+        <w:rPr>
+          <w:lang w:val="en-US"/>
+        </w:rPr>
+        <w:t>-</w:t>
+      </w:r>
+      <w:r>
+        <w:rPr>
+          <w:lang w:val="en-US"/>
+        </w:rPr>
+        <w:t>structural questions that test single concepts like "What does this variable store?" to extended abstract questions like "Design a program that solves this complex problem using multiple data structures." Their framework provides a structured way to ensure that questions across all complexity levels are included</w:t>
       </w:r>
       <w:r>
         <w:rPr>
@@ -656,13 +876,22 @@
         <w:t>The system is split into three main parts: the backend, the frontend, and the AI layer. Each part has a specific job, and they communicate with each other through a REST API</w:t>
       </w:r>
       <w:r>
-        <w:t xml:space="preserve"> [</w:t>
-      </w:r>
-      <w:r>
-        <w:t>8</w:t>
-      </w:r>
-      <w:r>
-        <w:t>]</w:t>
+        <w:t xml:space="preserve"> </w:t>
+      </w:r>
+      <w:r>
+        <w:fldChar w:fldCharType="begin"/>
+      </w:r>
+      <w:r>
+        <w:instrText xml:space="preserve"> REF _Ref226579391 \n \h </w:instrText>
+      </w:r>
+      <w:r>
+        <w:fldChar w:fldCharType="separate"/>
+      </w:r>
+      <w:r>
+        <w:t>[8]</w:t>
+      </w:r>
+      <w:r>
+        <w:fldChar w:fldCharType="end"/>
       </w:r>
       <w:r>
         <w:t>. This kind of separation makes it easier to work on one part without breaking the others.</w:t>
@@ -684,13 +913,43 @@
         <w:t>The backend is written in Python using Flask</w:t>
       </w:r>
       <w:r>
-        <w:t xml:space="preserve"> [8]</w:t>
+        <w:t xml:space="preserve"> </w:t>
+      </w:r>
+      <w:r>
+        <w:fldChar w:fldCharType="begin"/>
+      </w:r>
+      <w:r>
+        <w:instrText xml:space="preserve"> REF _Ref226579414 \n \h </w:instrText>
+      </w:r>
+      <w:r>
+        <w:fldChar w:fldCharType="separate"/>
+      </w:r>
+      <w:r>
+        <w:t>[9]</w:t>
+      </w:r>
+      <w:r>
+        <w:fldChar w:fldCharType="end"/>
       </w:r>
       <w:r>
         <w:t>, handles all the business logic, like storing lessons in the database, generating questions, and managing quizzes. The database is SQLite</w:t>
       </w:r>
       <w:r>
-        <w:t xml:space="preserve"> [10]</w:t>
+        <w:t xml:space="preserve"> </w:t>
+      </w:r>
+      <w:r>
+        <w:fldChar w:fldCharType="begin"/>
+      </w:r>
+      <w:r>
+        <w:instrText xml:space="preserve"> REF _Ref226579427 \n \h </w:instrText>
+      </w:r>
+      <w:r>
+        <w:fldChar w:fldCharType="separate"/>
+      </w:r>
+      <w:r>
+        <w:t>[10]</w:t>
+      </w:r>
+      <w:r>
+        <w:fldChar w:fldCharType="end"/>
       </w:r>
       <w:r>
         <w:t>, which stores everything in a single file. This makes the system easy to set up because you do not need to install a separate database server.</w:t>
@@ -720,7 +979,42 @@
         <w:rPr>
           <w:lang w:val="en-US"/>
         </w:rPr>
-        <w:t xml:space="preserve"> [11]</w:t>
+        <w:t xml:space="preserve"> </w:t>
+      </w:r>
+      <w:r>
+        <w:rPr>
+          <w:lang w:val="en-US"/>
+        </w:rPr>
+        <w:fldChar w:fldCharType="begin"/>
+      </w:r>
+      <w:r>
+        <w:rPr>
+          <w:lang w:val="en-US"/>
+        </w:rPr>
+        <w:instrText xml:space="preserve"> REF _Ref226579447 \n \h </w:instrText>
+      </w:r>
+      <w:r>
+        <w:rPr>
+          <w:lang w:val="en-US"/>
+        </w:rPr>
+      </w:r>
+      <w:r>
+        <w:rPr>
+          <w:lang w:val="en-US"/>
+        </w:rPr>
+        <w:fldChar w:fldCharType="separate"/>
+      </w:r>
+      <w:r>
+        <w:rPr>
+          <w:lang w:val="en-US"/>
+        </w:rPr>
+        <w:t>[11]</w:t>
+      </w:r>
+      <w:r>
+        <w:rPr>
+          <w:lang w:val="en-US"/>
+        </w:rPr>
+        <w:fldChar w:fldCharType="end"/>
       </w:r>
       <w:r>
         <w:rPr>
@@ -745,7 +1039,22 @@
         <w:t xml:space="preserve">The frontend is a React </w:t>
       </w:r>
       <w:r>
-        <w:t xml:space="preserve">[12] </w:t>
+        <w:fldChar w:fldCharType="begin"/>
+      </w:r>
+      <w:r>
+        <w:instrText xml:space="preserve"> REF _Ref226579462 \n \h </w:instrText>
+      </w:r>
+      <w:r>
+        <w:fldChar w:fldCharType="separate"/>
+      </w:r>
+      <w:r>
+        <w:t>[12]</w:t>
+      </w:r>
+      <w:r>
+        <w:fldChar w:fldCharType="end"/>
+      </w:r>
+      <w:r>
+        <w:t xml:space="preserve"> </w:t>
       </w:r>
       <w:r>
         <w:t>application that provides the user interface. It has different components for different tasks. The CourseManager lets you create and organize courses. The LessonManager handles uploading and parsing PDF files. The QuestionGenerator triggers the AI to create questions. The QuestionBank shows all the generated questions and lets you edit or delete them. The QuizBuilder lets you put questions together into a quiz, and the QuizSolver is where students actually take the quiz.</w:t>
@@ -791,19 +1100,53 @@
         <w:t xml:space="preserve">There are four levels: Unistructural, Multistructural, Relational, and Extended Abstract. Each level corresponds to a different type of question. Unistructural questions ask about a single fact. Multistructural questions ask about multiple facts. Relational questions ask how things connect. And Extended Abstract questions ask students to apply what they learned in a new context. You can </w:t>
       </w:r>
       <w:r>
-        <w:t xml:space="preserve">see Figure 1 below below for visualization. </w:t>
-      </w:r>
-    </w:p>
-    <w:p>
-      <w:pPr>
+        <w:t xml:space="preserve">see </w:t>
+      </w:r>
+      <w:r>
+        <w:fldChar w:fldCharType="begin"/>
+      </w:r>
+      <w:r>
+        <w:instrText xml:space="preserve"> REF _Ref226579104 \h </w:instrText>
+      </w:r>
+      <w:r>
+        <w:fldChar w:fldCharType="separate"/>
+      </w:r>
+      <w:r>
+        <w:t>Figu</w:t>
+      </w:r>
+      <w:r>
+        <w:t>r</w:t>
+      </w:r>
+      <w:r>
+        <w:t xml:space="preserve">e </w:t>
+      </w:r>
+      <w:r>
+        <w:rPr>
+          <w:noProof/>
+        </w:rPr>
+        <w:t>1</w:t>
+      </w:r>
+      <w:r>
+        <w:fldChar w:fldCharType="end"/>
+      </w:r>
+      <w:r>
+        <w:t xml:space="preserve"> </w:t>
+      </w:r>
+      <w:r>
+        <w:t xml:space="preserve">below below for visualization. </w:t>
+      </w:r>
+    </w:p>
+    <w:p>
+      <w:pPr>
+        <w:keepNext/>
         <w:jc w:val="center"/>
       </w:pPr>
       <w:r>
         <w:drawing>
-          <wp:inline distT="0" distB="0" distL="0" distR="0" wp14:anchorId="45B9C83C" wp14:editId="6F48A473">
-            <wp:extent cx="3868616" cy="4179501"/>
+          <wp:inline distT="0" distB="0" distL="0" distR="0" wp14:anchorId="79F28A2C" wp14:editId="593D4D03">
+            <wp:extent cx="4444322" cy="4800600"/>
             <wp:effectExtent l="0" t="0" r="0" b="0"/>
-            <wp:docPr id="783361881" name="Picture 1" descr="A diagram of multi-structural level"/>
+            <wp:docPr id="229679420" name="Picture 1"/>
             <wp:cNvGraphicFramePr>
               <a:graphicFrameLocks xmlns:a="http://schemas.openxmlformats.org/drawingml/2006/main" noChangeAspect="1"/>
             </wp:cNvGraphicFramePr>
@@ -811,11 +1154,11 @@
               <a:graphicData uri="http://schemas.openxmlformats.org/drawingml/2006/picture">
                 <pic:pic xmlns:pic="http://schemas.openxmlformats.org/drawingml/2006/picture">
                   <pic:nvPicPr>
-                    <pic:cNvPr id="783361881" name="Picture 1" descr="A diagram of multi-structural level"/>
+                    <pic:cNvPr id="229679420" name=""/>
                     <pic:cNvPicPr/>
                   </pic:nvPicPr>
                   <pic:blipFill>
-                    <a:blip r:embed="rId14"/>
+                    <a:blip r:embed="rId10"/>
                     <a:stretch>
                       <a:fillRect/>
                     </a:stretch>
@@ -823,7 +1166,7 @@
                   <pic:spPr>
                     <a:xfrm>
                       <a:off x="0" y="0"/>
-                      <a:ext cx="3881802" cy="4193747"/>
+                      <a:ext cx="4458998" cy="4816452"/>
                     </a:xfrm>
                     <a:prstGeom prst="rect">
                       <a:avLst/>
@@ -838,13 +1181,23 @@
     </w:p>
     <w:p>
       <w:pPr>
-        <w:jc w:val="center"/>
-      </w:pPr>
-      <w:r>
-        <w:t xml:space="preserve">Figure 1 - </w:t>
-      </w:r>
-      <w:r>
-        <w:t>SOLO question structure diagram</w:t>
+        <w:pStyle w:val="Caption"/>
+      </w:pPr>
+      <w:bookmarkStart w:id="0" w:name="_Ref226579104"/>
+      <w:r>
+        <w:t xml:space="preserve">Figure </w:t>
+      </w:r>
+      <w:fldSimple w:instr=" SEQ Figure \* ARABIC ">
+        <w:r>
+          <w:rPr>
+            <w:noProof/>
+          </w:rPr>
+          <w:t>1</w:t>
+        </w:r>
+      </w:fldSimple>
+      <w:bookmarkEnd w:id="0"/>
+      <w:r>
+        <w:t xml:space="preserve"> Solo question structure diagram</w:t>
       </w:r>
     </w:p>
     <w:p>
@@ -1033,19 +1386,91 @@
         <w:rPr>
           <w:lang w:val="en-US"/>
         </w:rPr>
-        <w:t>figure 2.</w:t>
+        <w:fldChar w:fldCharType="begin"/>
+      </w:r>
+      <w:r>
+        <w:rPr>
+          <w:lang w:val="en-US"/>
+        </w:rPr>
+        <w:instrText xml:space="preserve"> REF _Ref226579156 \h </w:instrText>
+      </w:r>
+      <w:r>
+        <w:rPr>
+          <w:lang w:val="en-US"/>
+        </w:rPr>
+      </w:r>
+      <w:r>
+        <w:rPr>
+          <w:lang w:val="en-US"/>
+        </w:rPr>
+        <w:fldChar w:fldCharType="separate"/>
+      </w:r>
+      <w:r>
+        <w:rPr>
+          <w:lang w:val="en-US"/>
+        </w:rPr>
+        <w:fldChar w:fldCharType="end"/>
+      </w:r>
+      <w:r>
+        <w:rPr>
+          <w:lang w:val="en-US"/>
+        </w:rPr>
+        <w:fldChar w:fldCharType="begin"/>
+      </w:r>
+      <w:r>
+        <w:rPr>
+          <w:lang w:val="en-US"/>
+        </w:rPr>
+        <w:instrText xml:space="preserve"> REF _Ref226579162 \h </w:instrText>
+      </w:r>
+      <w:r>
+        <w:rPr>
+          <w:lang w:val="en-US"/>
+        </w:rPr>
+      </w:r>
+      <w:r>
+        <w:rPr>
+          <w:lang w:val="en-US"/>
+        </w:rPr>
+        <w:fldChar w:fldCharType="separate"/>
+      </w:r>
+      <w:r>
+        <w:t>Figur</w:t>
+      </w:r>
+      <w:r>
+        <w:t>e</w:t>
+      </w:r>
+      <w:r>
+        <w:t xml:space="preserve"> </w:t>
+      </w:r>
+      <w:r>
+        <w:rPr>
+          <w:noProof/>
+        </w:rPr>
+        <w:t>2</w:t>
+      </w:r>
+      <w:r>
+        <w:rPr>
+          <w:lang w:val="en-US"/>
+        </w:rPr>
+        <w:fldChar w:fldCharType="end"/>
+      </w:r>
+      <w:r>
+        <w:rPr>
+          <w:lang w:val="en-US"/>
+        </w:rPr>
+        <w:t>.</w:t>
       </w:r>
     </w:p>
     <w:p>
       <w:pPr>
         <w:pStyle w:val="NoSpacing"/>
+        <w:keepNext/>
         <w:jc w:val="center"/>
-        <w:rPr>
-          <w:lang w:val="en-US"/>
-        </w:rPr>
-      </w:pPr>
-      <w:r>
-        <w:rPr>
+      </w:pPr>
+      <w:r>
+        <w:rPr>
+          <w:noProof/>
           <w:lang w:val="en-US"/>
         </w:rPr>
         <w:lastRenderedPageBreak/>
@@ -1067,7 +1492,7 @@
                     </pic:cNvPicPr>
                   </pic:nvPicPr>
                   <pic:blipFill>
-                    <a:blip r:embed="rId15" cstate="print">
+                    <a:blip r:embed="rId11" cstate="print">
                       <a:extLst>
                         <a:ext uri="{28A0092B-C50C-407E-A947-70E740481C1C}">
                           <a14:useLocalDpi xmlns:a14="http://schemas.microsoft.com/office/drawing/2010/main" val="0"/>
@@ -1101,18 +1526,29 @@
     </w:p>
     <w:p>
       <w:pPr>
-        <w:pStyle w:val="NoSpacing"/>
-        <w:jc w:val="center"/>
-        <w:rPr>
-          <w:lang w:val="en-US"/>
-        </w:rPr>
-      </w:pPr>
-      <w:r>
-        <w:rPr>
-          <w:lang w:val="en-US"/>
-        </w:rPr>
-        <w:t>Figure 2 – Workflow diagram</w:t>
-      </w:r>
+        <w:pStyle w:val="Caption"/>
+        <w:rPr>
+          <w:lang w:val="en-US"/>
+        </w:rPr>
+      </w:pPr>
+      <w:bookmarkStart w:id="1" w:name="_Ref226579156"/>
+      <w:bookmarkStart w:id="2" w:name="_Ref226579162"/>
+      <w:r>
+        <w:t xml:space="preserve">Figure </w:t>
+      </w:r>
+      <w:fldSimple w:instr=" SEQ Figure \* ARABIC ">
+        <w:r>
+          <w:rPr>
+            <w:noProof/>
+          </w:rPr>
+          <w:t>2</w:t>
+        </w:r>
+      </w:fldSimple>
+      <w:bookmarkEnd w:id="2"/>
+      <w:r>
+        <w:t xml:space="preserve"> Workflow diagram</w:t>
+      </w:r>
+      <w:bookmarkEnd w:id="1"/>
     </w:p>
     <w:p>
       <w:pPr>
@@ -1139,7 +1575,19 @@
         <w:rPr>
           <w:lang w:val="en-US"/>
         </w:rPr>
-        <w:t>The chatbot uses a Retrieval-Augmented Generation (RAG) approach. When a student asks a question, the system first searches the database for relevant content. It looks through lessons, sections, and learning objects to find text that matches the question. This context is then included in the prompt sent to the language model, so the response is grounded in the actual course material</w:t>
+        <w:t>The chatbot uses a Retrieval</w:t>
+      </w:r>
+      <w:r>
+        <w:rPr>
+          <w:lang w:val="en-US"/>
+        </w:rPr>
+        <w:t xml:space="preserve"> </w:t>
+      </w:r>
+      <w:r>
+        <w:rPr>
+          <w:lang w:val="en-US"/>
+        </w:rPr>
+        <w:t>Augmented Generation (RAG) approach. When a student asks a question, the system first searches the database for relevant content. It looks through lessons, sections, and learning objects to find text that matches the question. This context is then included in the prompt sent to the language model, so the response is grounded in the actual course material</w:t>
       </w:r>
       <w:r>
         <w:rPr>
@@ -1153,7 +1601,13 @@
         <w:pStyle w:val="Heading2"/>
       </w:pPr>
       <w:r>
-        <w:t>Multi-Language Support</w:t>
+        <w:t>Multi</w:t>
+      </w:r>
+      <w:r>
+        <w:t xml:space="preserve"> </w:t>
+      </w:r>
+      <w:r>
+        <w:t>Language Support</w:t>
       </w:r>
     </w:p>
     <w:p>
@@ -1225,7 +1679,25 @@
         <w:pStyle w:val="Paragraph"/>
       </w:pPr>
       <w:r>
-        <w:t>Unistructural Example: "The Program Counter (PC) holds the memory address of which type of entity?" The options were: A) The next instruction to be executed, B) The current executing instruction, C) All instructions in memory, D) Data variables. The correct answer is A. This item successfully isolates a single, fundamental concept—the specific function of the Program Counter. The distractors show variable quality. Option B is particularly effective, exploiting temporal confusion between "next" and "current" that targets students with incomplete understanding of the fetch-execute cycle. Option C addresses a novice misconception about PC scope, though it may be somewhat obvious to students who understand that registers hold single values. Option D, while testing the distinction between instruction and data addresses, is the weakest distractor—students with even basic architecture knowledge would likely recognize that the PC relates to instructions rather than data variables, making this option easily eliminated.</w:t>
+        <w:t>Unistructural Example: "The Program Counter (PC) holds the memory address of which type of entity?" The options were: A) The next instruction to be executed, B) The current executing instruction, C) All instructions in memory, D) Data variables. The correct answer is A. This item successfully isolates a single, fundamental concept</w:t>
+      </w:r>
+      <w:r>
+        <w:t xml:space="preserve">, </w:t>
+      </w:r>
+      <w:r>
+        <w:t>the specific function of the Program Counter. The distractors show variable quality. Option B is particularly effective, exploiting temporal confusion between "next" and "current" that targets students with incomplete understanding of the fetch</w:t>
+      </w:r>
+      <w:r>
+        <w:t xml:space="preserve"> </w:t>
+      </w:r>
+      <w:r>
+        <w:t>execute cycle. Option C addresses a novice misconception about PC scope, though it may be somewhat obvious to students who understand that registers hold single values. Option D, while testing the distinction between instruction and data addresses, is the weakest distractor</w:t>
+      </w:r>
+      <w:r>
+        <w:t xml:space="preserve">, </w:t>
+      </w:r>
+      <w:r>
+        <w:t>students with even basic architecture knowledge would likely recognize that the PC relates to instructions rather than data variables, making this option easily eliminated.</w:t>
       </w:r>
     </w:p>
     <w:p>
@@ -1241,7 +1713,31 @@
         <w:pStyle w:val="Paragraph"/>
       </w:pPr>
       <w:r>
-        <w:t>Multistructural Example: "Which of the following statements correctly describe both User-Level Threads (ULT) and Kernel-Level Threads (KLT)?" The options were: A) ULT are managed by application, KLT by OS; ULT can provide finer control but may be less efficient than KLT, B) Both ULT and KLT require explicit synchronization mechanisms to prevent race conditions, C) ULT provides more system resources allocation units compared to KLT, D) Kernel manages both ULT and KLT, providing equal efficiency and control. The correct answer is A. Option B is well-constructed, appearing plausible since synchronization is genuinely relevant to threading, though it incorrectly universalizes a concern that varies by implementation. Option D effectively targets the misconception that kernel management equalizes all thread characteristics. Option C, however, is the weakest distractor—the phrasing "provides more system resources allocation units" is awkwardly technical and vague enough that students might eliminate it based on unclear wording rather than actual knowledge of thread resource allocation.</w:t>
+        <w:t>Multistructural Example: "Which of the following statements correctly describe both User</w:t>
+      </w:r>
+      <w:r>
+        <w:t xml:space="preserve"> </w:t>
+      </w:r>
+      <w:r>
+        <w:t>Level Threads (ULT) and Kernel</w:t>
+      </w:r>
+      <w:r>
+        <w:t xml:space="preserve"> </w:t>
+      </w:r>
+      <w:r>
+        <w:t>Level Threads (KLT)?" The options were: A) ULT are managed by application, KLT by OS; ULT can provide finer control but may be less efficient than KLT, B) Both ULT and KLT require explicit synchronization mechanisms to prevent race conditions, C) ULT provides more system resources allocation units compared to KLT, D) Kernel manages both ULT and KLT, providing equal efficiency and control. The correct answer is A. Option B is well</w:t>
+      </w:r>
+      <w:r>
+        <w:t xml:space="preserve"> </w:t>
+      </w:r>
+      <w:r>
+        <w:t>constructed, appearing plausible since synchronization is genuinely relevant to threading, though it incorrectly universalizes a concern that varies by implementation. Option D effectively targets the misconception that kernel management equalizes all thread characteristics. Option C, however, is the weakest distractor</w:t>
+      </w:r>
+      <w:r>
+        <w:t xml:space="preserve">, </w:t>
+      </w:r>
+      <w:r>
+        <w:t>the phrasing "provides more system resources allocation units" is awkwardly technical and vague enough that students might eliminate it based on unclear wording rather than actual knowledge of thread resource allocation.</w:t>
       </w:r>
     </w:p>
     <w:p>
@@ -1257,7 +1753,19 @@
         <w:pStyle w:val="Paragraph"/>
       </w:pPr>
       <w:r>
-        <w:t>Relational Example: "How does test automation contribute to the effectiveness of regression testing?" The options were: A) Test automation only improves the speed of functional testing without impacting regression testing, B) Test automation replaces manual testing entirely, making regression testing unnecessary, C) Test automation allows for faster execution and identification of changes in functionality, enhancing the thoroughness of regression tests, D) Test automation focuses on creating new test cases rather than running existing ones efficiently. The correct answer is C. The question successfully requires students to connect two concepts—understanding both what regression testing entails (re-executing existing tests to detect unintended changes) and how automation specifically addresses its challenges. The distractors show reasonable quality. Option B captures an extreme misconception about automation replacing human judgment entirely, while Option A creates an artificial boundary between functional and regression testing that might appeal to students with lesser understanding. However, Option D is problematic. The claim that "test automation focuses on creating new test cases" doesn't align with any common misconception about automation—most students would recognize that automation executes tests rather than generates them. This makes the distractor too easily eliminated. Additionally, Option A's specificity about "only functional testing" may be overly obvious, as students familiar with basic automation concepts would recognize that automated tests can serve multiple purposes. Stronger distractors might address misconceptions about automation coverage limitations or the false belief that automated tests detect different types of defects than manual regression testing.</w:t>
+        <w:t>Relational Example: "How does test automation contribute to the effectiveness of regression testing?" The options were: A) Test automation only improves the speed of functional testing without impacting regression testing, B) Test automation replaces manual testing entirely, making regression testing unnecessary, C) Test automation allows for faster execution and identification of changes in functionality, enhancing the thoroughness of regression tests, D) Test automation focuses on creating new test cases rather than running existing ones efficiently. The correct answer is C. The question successfully requires students to connect two concepts</w:t>
+      </w:r>
+      <w:r>
+        <w:t xml:space="preserve">, </w:t>
+      </w:r>
+      <w:r>
+        <w:t>understanding both what regression testing entails (re-executing existing tests to detect unintended changes) and how automation specifically addresses its challenges. The distractors show reasonable quality. Option B captures an extreme misconception about automation replacing human judgment entirely, while Option A creates an artificial boundary between functional and regression testing that might appeal to students with lesser understanding. However, Option D is problematic. The claim that "test automation focuses on creating new test cases" doesn't align with any common misconception about automation</w:t>
+      </w:r>
+      <w:r>
+        <w:t xml:space="preserve">, </w:t>
+      </w:r>
+      <w:r>
+        <w:t>most students would recognize that automation executes tests rather than generates them. This makes the distractor too easily eliminated. Additionally, Option A's specificity about "only functional testing" may be overly obvious, as students familiar with basic automation concepts would recognize that automated tests can serve multiple purposes. Stronger distractors might address misconceptions about automation coverage limitations or the false belief that automated tests detect different types of defects than manual regression testing.</w:t>
       </w:r>
     </w:p>
     <w:p>
@@ -1276,14 +1784,50 @@
         <w:pStyle w:val="Paragraph"/>
       </w:pPr>
       <w:r>
-        <w:t xml:space="preserve">Extended Abstract Example: "In a distributed computing environment, if a main process spawns multiple child processes across different nodes, what mechanism ensures that all child processes receive the correct system resources and do not interfere with each other?" The options were: A) Implementing inter-process communication (IPC) protocols to manage resource allocation and synchronization, B) Increasing the priority of the parent process over its children to control their execution flow, C) Allocating all child processes to a single node for centralized </w:t>
+        <w:t>Extended Abstract Example: "In a distributed computing environment, if a main process spawns multiple child processes across different nodes, what mechanism ensures that all child processes receive the correct system resources and do not interfere with each other?" The options were: A) Implementing inter</w:t>
+      </w:r>
+      <w:r>
+        <w:t xml:space="preserve"> </w:t>
+      </w:r>
+      <w:r>
+        <w:t xml:space="preserve">process communication (IPC) protocols to manage resource allocation and synchronization, B) Increasing the priority of the parent process over its children to control their execution flow, C) Allocating all child processes to a single node for centralized </w:t>
       </w:r>
       <w:r>
         <w:lastRenderedPageBreak/>
-        <w:t xml:space="preserve">management of resources, D) Using thread-level synchronization techniques within each individual node. The correct answer is A. This question takes the concept of process management learned in a single-machine context and asks the student to extend it to a distributed environment. Option C effectively identifies a common misconception (centralizing defeats distribution), and Option D </w:t>
-      </w:r>
-      <w:r>
-        <w:t>correctly recognizes that thread-level synchronization addresses only intra-node concerns. However, Option B is too obviously incorrect—"increasing priority" doesn't logically connect to resource allocation or interference prevention across nodes, making it easily eliminated</w:t>
+        <w:t>management of resources, D) Using thread</w:t>
+      </w:r>
+      <w:r>
+        <w:t xml:space="preserve"> </w:t>
+      </w:r>
+      <w:r>
+        <w:t>level synchronization techniques within each individual node. The correct answer is A. This question takes the concept of process management learned in a single</w:t>
+      </w:r>
+      <w:r>
+        <w:t xml:space="preserve"> </w:t>
+      </w:r>
+      <w:r>
+        <w:t xml:space="preserve">machine context and asks the student to extend it to a distributed environment. Option C effectively identifies a common misconception (centralizing defeats distribution), and Option D </w:t>
+      </w:r>
+      <w:r>
+        <w:t>correctly recognizes that thread</w:t>
+      </w:r>
+      <w:r>
+        <w:t xml:space="preserve"> </w:t>
+      </w:r>
+      <w:r>
+        <w:t>level synchronization addresses only intra</w:t>
+      </w:r>
+      <w:r>
+        <w:t xml:space="preserve"> </w:t>
+      </w:r>
+      <w:r>
+        <w:t>node concerns. However, Option B is too obviously incorrect</w:t>
+      </w:r>
+      <w:r>
+        <w:t xml:space="preserve">, </w:t>
+      </w:r>
+      <w:r>
+        <w:t>"increasing priority" doesn't logically connect to resource allocation or interference prevention across nodes, making it easily eliminated</w:t>
       </w:r>
     </w:p>
     <w:p>
@@ -1299,7 +1843,19 @@
         <w:pStyle w:val="Paragraph"/>
       </w:pPr>
       <w:r>
-        <w:t xml:space="preserve">The evaluation revealed several systematic limitations in the question generation process. A clear pattern emerged across cognitive levels: as the taxonomic complexity increased from unistructural to extended abstract, question quality deteriorated. Lower-level questions (unistructural and multistructural) generally demonstrated stronger alignment with their intended cognitive levels. However, higher-level questions, particularly at the relational and extended abstract levels, exhibited significant validity concerns. The correct answers themselves sometimes contained technical inaccuracies or oversimplifications. </w:t>
+        <w:t>The evaluation revealed several systematic limitations in the question generation process. A clear pattern emerged across cognitive levels: as the taxonomic complexity increased from unistructural to extended abstract, question quality deteriorated. Lower</w:t>
+      </w:r>
+      <w:r>
+        <w:t xml:space="preserve"> </w:t>
+      </w:r>
+      <w:r>
+        <w:t>level questions (unistructural and multistructural) generally demonstrated stronger alignment with their intended cognitive levels. However, higher</w:t>
+      </w:r>
+      <w:r>
+        <w:t xml:space="preserve"> </w:t>
+      </w:r>
+      <w:r>
+        <w:t xml:space="preserve">level questions, particularly at the relational and extended abstract levels, exhibited significant validity concerns. The correct answers themselves sometimes contained technical inaccuracies or oversimplifications. </w:t>
       </w:r>
     </w:p>
     <w:p>
@@ -1323,7 +1879,13 @@
         <w:pStyle w:val="Paragraph"/>
       </w:pPr>
       <w:r>
-        <w:t>This paper presented a system for automatically generating educational quizzes based on the SOLO taxonomy. The system combines local AI models, semantic web technology, and a user-friendly interface to help teachers create better assessments with less effort.</w:t>
+        <w:t>This paper presented a system for automatically generating educational quizzes based on the SOLO taxonomy. The system combines local AI models, semantic web technology, and a user</w:t>
+      </w:r>
+      <w:r>
+        <w:t xml:space="preserve"> </w:t>
+      </w:r>
+      <w:r>
+        <w:t>friendly interface to help teachers create better assessments with less effort.</w:t>
       </w:r>
     </w:p>
     <w:p>
@@ -1366,6 +1928,7 @@
           <w:rFonts w:asciiTheme="minorHAnsi" w:hAnsiTheme="minorHAnsi" w:cstheme="minorHAnsi"/>
         </w:rPr>
       </w:pPr>
+      <w:bookmarkStart w:id="3" w:name="_Ref226578959"/>
       <w:r>
         <w:rPr>
           <w:rFonts w:asciiTheme="minorHAnsi" w:hAnsiTheme="minorHAnsi" w:cstheme="minorHAnsi"/>
@@ -1405,6 +1968,7 @@
         </w:rPr>
         <w:t>(6), pp.511-527.</w:t>
       </w:r>
+      <w:bookmarkEnd w:id="3"/>
     </w:p>
     <w:p>
       <w:pPr>
@@ -1414,6 +1978,7 @@
           <w:rFonts w:asciiTheme="minorHAnsi" w:hAnsiTheme="minorHAnsi" w:cstheme="minorHAnsi"/>
         </w:rPr>
       </w:pPr>
+      <w:bookmarkStart w:id="4" w:name="_Ref226579002"/>
       <w:r>
         <w:rPr>
           <w:rFonts w:asciiTheme="minorHAnsi" w:hAnsiTheme="minorHAnsi" w:cstheme="minorHAnsi"/>
@@ -1421,6 +1986,7 @@
         </w:rPr>
         <w:t>Smith, B., 2012. Ontology.</w:t>
       </w:r>
+      <w:bookmarkEnd w:id="4"/>
     </w:p>
     <w:p>
       <w:pPr>
@@ -1430,6 +1996,7 @@
           <w:rFonts w:asciiTheme="minorHAnsi" w:hAnsiTheme="minorHAnsi" w:cstheme="minorHAnsi"/>
         </w:rPr>
       </w:pPr>
+      <w:bookmarkStart w:id="5" w:name="_Ref226579229"/>
       <w:r>
         <w:rPr>
           <w:rFonts w:asciiTheme="minorHAnsi" w:hAnsiTheme="minorHAnsi" w:cstheme="minorHAnsi"/>
@@ -1453,6 +2020,7 @@
         </w:rPr>
         <w:t> (pp. 23-35). Cham: Springer Nature Switzerland.</w:t>
       </w:r>
+      <w:bookmarkEnd w:id="5"/>
     </w:p>
     <w:p>
       <w:pPr>
@@ -1462,6 +2030,7 @@
           <w:rFonts w:asciiTheme="minorHAnsi" w:hAnsiTheme="minorHAnsi" w:cstheme="minorHAnsi"/>
         </w:rPr>
       </w:pPr>
+      <w:bookmarkStart w:id="6" w:name="_Ref226579268"/>
       <w:r>
         <w:rPr>
           <w:rFonts w:asciiTheme="minorHAnsi" w:hAnsiTheme="minorHAnsi" w:cstheme="minorHAnsi"/>
@@ -1485,6 +2054,7 @@
         </w:rPr>
         <w:t> (pp. 17-22).</w:t>
       </w:r>
+      <w:bookmarkEnd w:id="6"/>
     </w:p>
     <w:p>
       <w:pPr>
@@ -1494,6 +2064,7 @@
           <w:rFonts w:asciiTheme="minorHAnsi" w:hAnsiTheme="minorHAnsi" w:cstheme="minorHAnsi"/>
         </w:rPr>
       </w:pPr>
+      <w:bookmarkStart w:id="7" w:name="_Ref226579339"/>
       <w:r>
         <w:rPr>
           <w:rFonts w:asciiTheme="minorHAnsi" w:hAnsiTheme="minorHAnsi" w:cstheme="minorHAnsi"/>
@@ -1517,6 +2088,7 @@
         </w:rPr>
         <w:t> (pp. 284-290).</w:t>
       </w:r>
+      <w:bookmarkEnd w:id="7"/>
     </w:p>
     <w:p>
       <w:pPr>
@@ -1526,6 +2098,7 @@
           <w:rFonts w:asciiTheme="minorHAnsi" w:hAnsiTheme="minorHAnsi" w:cstheme="minorHAnsi"/>
         </w:rPr>
       </w:pPr>
+      <w:bookmarkStart w:id="8" w:name="_Ref226579354"/>
       <w:r>
         <w:rPr>
           <w:rFonts w:asciiTheme="minorHAnsi" w:hAnsiTheme="minorHAnsi" w:cstheme="minorHAnsi"/>
@@ -1565,6 +2138,7 @@
         </w:rPr>
         <w:t>, p.102274.</w:t>
       </w:r>
+      <w:bookmarkEnd w:id="8"/>
     </w:p>
     <w:p>
       <w:pPr>
@@ -1574,6 +2148,7 @@
           <w:rFonts w:asciiTheme="minorHAnsi" w:hAnsiTheme="minorHAnsi" w:cstheme="minorHAnsi"/>
         </w:rPr>
       </w:pPr>
+      <w:bookmarkStart w:id="9" w:name="_Ref226579366"/>
       <w:r>
         <w:rPr>
           <w:rFonts w:asciiTheme="minorHAnsi" w:hAnsiTheme="minorHAnsi" w:cstheme="minorHAnsi"/>
@@ -1613,6 +2188,7 @@
         </w:rPr>
         <w:t>(3), pp.118-122.</w:t>
       </w:r>
+      <w:bookmarkEnd w:id="9"/>
     </w:p>
     <w:p>
       <w:pPr>
@@ -1622,6 +2198,7 @@
           <w:rFonts w:asciiTheme="minorHAnsi" w:hAnsiTheme="minorHAnsi" w:cstheme="minorHAnsi"/>
         </w:rPr>
       </w:pPr>
+      <w:bookmarkStart w:id="10" w:name="_Ref226579391"/>
       <w:r>
         <w:rPr>
           <w:rFonts w:asciiTheme="minorHAnsi" w:hAnsiTheme="minorHAnsi" w:cstheme="minorHAnsi"/>
@@ -1645,6 +2222,7 @@
         </w:rPr>
         <w:t>. " O'Reilly Media, Inc.".</w:t>
       </w:r>
+      <w:bookmarkEnd w:id="10"/>
     </w:p>
     <w:p>
       <w:pPr>
@@ -1654,6 +2232,7 @@
           <w:rFonts w:asciiTheme="minorHAnsi" w:hAnsiTheme="minorHAnsi" w:cstheme="minorHAnsi"/>
         </w:rPr>
       </w:pPr>
+      <w:bookmarkStart w:id="11" w:name="_Ref226579414"/>
       <w:r>
         <w:rPr>
           <w:rFonts w:asciiTheme="minorHAnsi" w:hAnsiTheme="minorHAnsi" w:cstheme="minorHAnsi"/>
@@ -1693,6 +2272,7 @@
         </w:rPr>
         <w:t>(2).</w:t>
       </w:r>
+      <w:bookmarkEnd w:id="11"/>
     </w:p>
     <w:p>
       <w:pPr>
@@ -1702,6 +2282,7 @@
           <w:rFonts w:asciiTheme="minorHAnsi" w:hAnsiTheme="minorHAnsi" w:cstheme="minorHAnsi"/>
         </w:rPr>
       </w:pPr>
+      <w:bookmarkStart w:id="12" w:name="_Ref226579427"/>
       <w:r>
         <w:rPr>
           <w:rFonts w:asciiTheme="minorHAnsi" w:hAnsiTheme="minorHAnsi" w:cstheme="minorHAnsi"/>
@@ -1725,6 +2306,7 @@
         </w:rPr>
         <w:t>. " O'Reilly Media, Inc.".</w:t>
       </w:r>
+      <w:bookmarkEnd w:id="12"/>
     </w:p>
     <w:p>
       <w:pPr>
@@ -1734,6 +2316,7 @@
           <w:rFonts w:asciiTheme="minorHAnsi" w:hAnsiTheme="minorHAnsi" w:cstheme="minorHAnsi"/>
         </w:rPr>
       </w:pPr>
+      <w:bookmarkStart w:id="13" w:name="_Ref226579447"/>
       <w:r>
         <w:rPr>
           <w:rFonts w:asciiTheme="minorHAnsi" w:hAnsiTheme="minorHAnsi" w:cstheme="minorHAnsi"/>
@@ -1773,6 +2356,7 @@
         </w:rPr>
         <w:t>(3), pp.1-45.</w:t>
       </w:r>
+      <w:bookmarkEnd w:id="13"/>
     </w:p>
     <w:p>
       <w:pPr>
@@ -1782,6 +2366,7 @@
           <w:rFonts w:asciiTheme="minorHAnsi" w:hAnsiTheme="minorHAnsi" w:cstheme="minorHAnsi"/>
         </w:rPr>
       </w:pPr>
+      <w:bookmarkStart w:id="14" w:name="_Ref226579462"/>
       <w:r>
         <w:rPr>
           <w:rFonts w:asciiTheme="minorHAnsi" w:hAnsiTheme="minorHAnsi" w:cstheme="minorHAnsi"/>
@@ -1805,10 +2390,11 @@
         </w:rPr>
         <w:t>. Apress.</w:t>
       </w:r>
+      <w:bookmarkEnd w:id="14"/>
     </w:p>
     <w:sectPr>
-      <w:headerReference w:type="default" r:id="rId16"/>
-      <w:footerReference w:type="default" r:id="rId17"/>
+      <w:headerReference w:type="default" r:id="rId12"/>
+      <w:footerReference w:type="default" r:id="rId13"/>
       <w:type w:val="continuous"/>
       <w:pgSz w:w="11906" w:h="16838" w:code="9"/>
       <w:pgMar w:top="851" w:right="851" w:bottom="851" w:left="851" w:header="284" w:footer="44" w:gutter="0"/>
@@ -3317,6 +3903,7 @@
   <w:style w:type="character" w:default="1" w:styleId="DefaultParagraphFont">
     <w:name w:val="Default Paragraph Font"/>
     <w:uiPriority w:val="1"/>
+    <w:semiHidden/>
     <w:unhideWhenUsed/>
   </w:style>
   <w:style w:type="table" w:default="1" w:styleId="TableNormal">

</xml_diff>